<commit_message>
Update ECS implementation instructions (docx)
Replace the ECS_implementation_instructions_using_AWS_console.docx file with an updated binary Word document containing revised ECS implementation steps for the AWS Console. This is a binary-only change so no textual diff is available; consult the updated document for details.
</commit_message>
<xml_diff>
--- a/ecs_version/ECS_implementation_instructions_using_AWS_console.docx
+++ b/ecs_version/ECS_implementation_instructions_using_AWS_console.docx
@@ -16,7 +16,7 @@
       </w:pPr>
       <w:r>
         <w:pict w14:anchorId="476368FF">
-          <v:rect id="_x0000_i1097" style="width:0;height:1.5pt" o:hralign="center" o:hrstd="t" o:hr="t" fillcolor="#a0a0a0" stroked="f"/>
+          <v:rect id="_x0000_i1025" style="width:0;height:1.5pt" o:hralign="center" o:hrstd="t" o:hr="t" fillcolor="#a0a0a0" stroked="f"/>
         </w:pict>
       </w:r>
     </w:p>
@@ -217,7 +217,7 @@
       </w:pPr>
       <w:r>
         <w:pict w14:anchorId="4BBFEA02">
-          <v:rect id="_x0000_i1098" style="width:0;height:1.5pt" o:hralign="center" o:hrstd="t" o:hr="t" fillcolor="#a0a0a0" stroked="f"/>
+          <v:rect id="_x0000_i1026" style="width:0;height:1.5pt" o:hralign="center" o:hrstd="t" o:hr="t" fillcolor="#a0a0a0" stroked="f"/>
         </w:pict>
       </w:r>
     </w:p>
@@ -484,7 +484,7 @@
         <w:tblLook w:val="04A0" w:firstRow="1" w:lastRow="0" w:firstColumn="1" w:lastColumn="0" w:noHBand="0" w:noVBand="1"/>
       </w:tblPr>
       <w:tblGrid>
-        <w:gridCol w:w="2645"/>
+        <w:gridCol w:w="3526"/>
         <w:gridCol w:w="2104"/>
       </w:tblGrid>
       <w:tr>
@@ -640,7 +640,18 @@
               <w:pStyle w:val="NoSpacing"/>
             </w:pPr>
             <w:r>
-              <w:t>10.0.11.0/24 (private, AZ-a)</w:t>
+              <w:t>10.0.11.0/24 (</w:t>
+            </w:r>
+            <w:r>
+              <w:rPr>
+                <w:b/>
+                <w:bCs/>
+                <w:color w:val="EE0000"/>
+              </w:rPr>
+              <w:t>private, AZ-a</w:t>
+            </w:r>
+            <w:r>
+              <w:t>)</w:t>
             </w:r>
           </w:p>
         </w:tc>
@@ -683,7 +694,18 @@
               <w:pStyle w:val="NoSpacing"/>
             </w:pPr>
             <w:r>
-              <w:t>10.0.12.0/24 (private, AZ-b)</w:t>
+              <w:t>10.0.12.0/24 (</w:t>
+            </w:r>
+            <w:r>
+              <w:rPr>
+                <w:b/>
+                <w:bCs/>
+                <w:color w:val="EE0000"/>
+              </w:rPr>
+              <w:t>private, AZ-b</w:t>
+            </w:r>
+            <w:r>
+              <w:t>)</w:t>
             </w:r>
           </w:p>
         </w:tc>
@@ -726,7 +748,26 @@
               <w:pStyle w:val="NoSpacing"/>
             </w:pPr>
             <w:r>
-              <w:t>10.0.21.0/24 (private, AZ-a)</w:t>
+              <w:t>10.0.21.0/24 (</w:t>
+            </w:r>
+            <w:r>
+              <w:rPr>
+                <w:b/>
+                <w:bCs/>
+                <w:color w:val="EE0000"/>
+              </w:rPr>
+              <w:t>private, AZ-</w:t>
+            </w:r>
+            <w:r>
+              <w:rPr>
+                <w:b/>
+                <w:bCs/>
+                <w:color w:val="EE0000"/>
+              </w:rPr>
+              <w:t>c</w:t>
+            </w:r>
+            <w:r>
+              <w:t>)</w:t>
             </w:r>
           </w:p>
         </w:tc>
@@ -769,7 +810,26 @@
               <w:pStyle w:val="NoSpacing"/>
             </w:pPr>
             <w:r>
-              <w:t>10.0.22.0/24 (private, AZ-b)</w:t>
+              <w:t>10.0.22.0/24 (</w:t>
+            </w:r>
+            <w:r>
+              <w:rPr>
+                <w:b/>
+                <w:bCs/>
+                <w:color w:val="EE0000"/>
+              </w:rPr>
+              <w:t>private, AZ-</w:t>
+            </w:r>
+            <w:r>
+              <w:rPr>
+                <w:b/>
+                <w:bCs/>
+                <w:color w:val="EE0000"/>
+              </w:rPr>
+              <w:t>d</w:t>
+            </w:r>
+            <w:r>
+              <w:t>)</w:t>
             </w:r>
           </w:p>
         </w:tc>
@@ -797,6 +857,72 @@
           </w:p>
         </w:tc>
       </w:tr>
+      <w:tr>
+        <w:trPr>
+          <w:tblCellSpacing w:w="15" w:type="dxa"/>
+        </w:trPr>
+        <w:tc>
+          <w:tcPr>
+            <w:tcW w:w="0" w:type="auto"/>
+            <w:vAlign w:val="center"/>
+          </w:tcPr>
+          <w:p>
+            <w:pPr>
+              <w:pStyle w:val="NoSpacing"/>
+            </w:pPr>
+            <w:r>
+              <w:rPr>
+                <w:b/>
+                <w:bCs/>
+                <w:color w:val="EE0000"/>
+              </w:rPr>
+              <w:t>Note:</w:t>
+            </w:r>
+            <w:r>
+              <w:t xml:space="preserve"> Each </w:t>
+            </w:r>
+            <w:r>
+              <w:t xml:space="preserve">private </w:t>
+            </w:r>
+            <w:r>
+              <w:t xml:space="preserve">subnet should be </w:t>
+            </w:r>
+          </w:p>
+          <w:p>
+            <w:pPr>
+              <w:pStyle w:val="NoSpacing"/>
+            </w:pPr>
+            <w:r>
+              <w:t xml:space="preserve">deployed in </w:t>
+            </w:r>
+            <w:r>
+              <w:t>an</w:t>
+            </w:r>
+            <w:r>
+              <w:t xml:space="preserve"> AZ different from the </w:t>
+            </w:r>
+          </w:p>
+          <w:p>
+            <w:pPr>
+              <w:pStyle w:val="NoSpacing"/>
+            </w:pPr>
+            <w:r>
+              <w:t>other subnets.</w:t>
+            </w:r>
+          </w:p>
+        </w:tc>
+        <w:tc>
+          <w:tcPr>
+            <w:tcW w:w="0" w:type="auto"/>
+            <w:vAlign w:val="center"/>
+          </w:tcPr>
+          <w:p>
+            <w:pPr>
+              <w:pStyle w:val="NoSpacing"/>
+            </w:pPr>
+          </w:p>
+        </w:tc>
+      </w:tr>
     </w:tbl>
     <w:p>
       <w:pPr>
@@ -804,7 +930,7 @@
       </w:pPr>
       <w:r>
         <w:pict w14:anchorId="1C8133BB">
-          <v:rect id="_x0000_i1099" style="width:0;height:1.5pt" o:hralign="center" o:hrstd="t" o:hr="t" fillcolor="#a0a0a0" stroked="f"/>
+          <v:rect id="_x0000_i1027" style="width:0;height:1.5pt" o:hralign="center" o:hrstd="t" o:hr="t" fillcolor="#a0a0a0" stroked="f"/>
         </w:pict>
       </w:r>
     </w:p>
@@ -896,6 +1022,7 @@
         </w:numPr>
       </w:pPr>
       <w:r>
+        <w:lastRenderedPageBreak/>
         <w:t>VPC: select content-moderator</w:t>
       </w:r>
     </w:p>
@@ -952,7 +1079,6 @@
         </w:numPr>
       </w:pPr>
       <w:r>
-        <w:lastRenderedPageBreak/>
         <w:t xml:space="preserve">Type: </w:t>
       </w:r>
       <w:r>
@@ -1376,7 +1502,7 @@
       </w:pPr>
       <w:r>
         <w:pict w14:anchorId="23AA6115">
-          <v:rect id="_x0000_i1100" style="width:0;height:1.5pt" o:hralign="center" o:hrstd="t" o:hr="t" fillcolor="#a0a0a0" stroked="f"/>
+          <v:rect id="_x0000_i1028" style="width:0;height:1.5pt" o:hralign="center" o:hrstd="t" o:hr="t" fillcolor="#a0a0a0" stroked="f"/>
         </w:pict>
       </w:r>
     </w:p>
@@ -1649,13 +1775,8 @@
               <w:pStyle w:val="NoSpacing"/>
             </w:pPr>
             <w:r>
-              <w:t>com.amazonaws.us-east-</w:t>
+              <w:t>com.amazonaws.us-east-1.logs</w:t>
             </w:r>
-            <w:proofErr w:type="gramStart"/>
-            <w:r>
-              <w:t>1.logs</w:t>
-            </w:r>
-            <w:proofErr w:type="gramEnd"/>
           </w:p>
         </w:tc>
         <w:tc>
@@ -1704,15 +1825,7 @@
               <w:pStyle w:val="NoSpacing"/>
             </w:pPr>
             <w:r>
-              <w:t>com.amazonaws.us-east-</w:t>
-            </w:r>
-            <w:proofErr w:type="gramStart"/>
-            <w:r>
-              <w:t>1.bedrock</w:t>
-            </w:r>
-            <w:proofErr w:type="gramEnd"/>
-            <w:r>
-              <w:t>-runtime</w:t>
+              <w:t>com.amazonaws.us-east-1.bedrock-runtime</w:t>
             </w:r>
           </w:p>
         </w:tc>
@@ -1762,13 +1875,8 @@
               <w:pStyle w:val="NoSpacing"/>
             </w:pPr>
             <w:r>
-              <w:t>com.amazonaws.us-east-</w:t>
+              <w:t>com.amazonaws.us-east-1.dynamodb</w:t>
             </w:r>
-            <w:proofErr w:type="gramStart"/>
-            <w:r>
-              <w:t>1.dynamodb</w:t>
-            </w:r>
-            <w:proofErr w:type="gramEnd"/>
           </w:p>
         </w:tc>
         <w:tc>
@@ -1830,15 +1938,7 @@
         </w:numPr>
       </w:pPr>
       <w:r>
-        <w:t>Service name: com.amazonaws.us-east-</w:t>
-      </w:r>
-      <w:proofErr w:type="gramStart"/>
-      <w:r>
-        <w:t>1.s</w:t>
-      </w:r>
-      <w:proofErr w:type="gramEnd"/>
-      <w:r>
-        <w:t>3</w:t>
+        <w:t>Service name: com.amazonaws.us-east-1.s3</w:t>
       </w:r>
     </w:p>
     <w:p>
@@ -1882,10 +1982,120 @@
     <w:p>
       <w:pPr>
         <w:pStyle w:val="NoSpacing"/>
+        <w:rPr>
+          <w:b/>
+          <w:bCs/>
+        </w:rPr>
+      </w:pPr>
+    </w:p>
+    <w:p>
+      <w:pPr>
+        <w:pStyle w:val="NoSpacing"/>
+      </w:pPr>
+      <w:r>
+        <w:rPr>
+          <w:b/>
+          <w:bCs/>
+          <w:color w:val="EE0000"/>
+        </w:rPr>
+        <w:t>Note:</w:t>
+      </w:r>
+      <w:r>
+        <w:t xml:space="preserve"> </w:t>
+      </w:r>
+      <w:r>
+        <w:t xml:space="preserve">For </w:t>
+      </w:r>
+      <w:proofErr w:type="spellStart"/>
+      <w:r>
+        <w:rPr>
+          <w:b/>
+          <w:bCs/>
+        </w:rPr>
+        <w:t>ecr.dkr</w:t>
+      </w:r>
+      <w:proofErr w:type="spellEnd"/>
+      <w:r>
+        <w:t xml:space="preserve">, </w:t>
+      </w:r>
+      <w:proofErr w:type="spellStart"/>
+      <w:r>
+        <w:rPr>
+          <w:b/>
+          <w:bCs/>
+        </w:rPr>
+        <w:t>ecr.api</w:t>
+      </w:r>
+      <w:proofErr w:type="spellEnd"/>
+      <w:r>
+        <w:t xml:space="preserve"> and </w:t>
+      </w:r>
+      <w:r>
+        <w:rPr>
+          <w:b/>
+          <w:bCs/>
+        </w:rPr>
+        <w:t>.logs</w:t>
+      </w:r>
+      <w:r>
+        <w:t>, create an (interface) endpoint for the frontend subnets and another (interface) endpoint for the backend subnets. See screenshot below.</w:t>
+      </w:r>
+    </w:p>
+    <w:p>
+      <w:pPr>
+        <w:pStyle w:val="NoSpacing"/>
+      </w:pPr>
+      <w:r>
+        <w:lastRenderedPageBreak/>
+        <w:drawing>
+          <wp:inline distT="0" distB="0" distL="0" distR="0" wp14:anchorId="47028881" wp14:editId="67BD53B4">
+            <wp:extent cx="5943600" cy="2111375"/>
+            <wp:effectExtent l="0" t="0" r="0" b="3175"/>
+            <wp:docPr id="1828385793" name="Picture 1" descr="The image shows a list of various Amazon VPC endpoints with their IDs, types, statuses, and interfaces, all displayed in a table format.&#10;&#10;AI-generated content may be incorrect."/>
+            <wp:cNvGraphicFramePr>
+              <a:graphicFrameLocks xmlns:a="http://schemas.openxmlformats.org/drawingml/2006/main" noChangeAspect="1"/>
+            </wp:cNvGraphicFramePr>
+            <a:graphic xmlns:a="http://schemas.openxmlformats.org/drawingml/2006/main">
+              <a:graphicData uri="http://schemas.openxmlformats.org/drawingml/2006/picture">
+                <pic:pic xmlns:pic="http://schemas.openxmlformats.org/drawingml/2006/picture">
+                  <pic:nvPicPr>
+                    <pic:cNvPr id="1828385793" name="Picture 1" descr="The image shows a list of various Amazon VPC endpoints with their IDs, types, statuses, and interfaces, all displayed in a table format.&#10;&#10;AI-generated content may be incorrect."/>
+                    <pic:cNvPicPr/>
+                  </pic:nvPicPr>
+                  <pic:blipFill>
+                    <a:blip r:embed="rId5"/>
+                    <a:stretch>
+                      <a:fillRect/>
+                    </a:stretch>
+                  </pic:blipFill>
+                  <pic:spPr>
+                    <a:xfrm>
+                      <a:off x="0" y="0"/>
+                      <a:ext cx="5943600" cy="2111375"/>
+                    </a:xfrm>
+                    <a:prstGeom prst="rect">
+                      <a:avLst/>
+                    </a:prstGeom>
+                  </pic:spPr>
+                </pic:pic>
+              </a:graphicData>
+            </a:graphic>
+          </wp:inline>
+        </w:drawing>
+      </w:r>
+    </w:p>
+    <w:p>
+      <w:pPr>
+        <w:pStyle w:val="NoSpacing"/>
+      </w:pPr>
+    </w:p>
+    <w:p>
+      <w:pPr>
+        <w:pStyle w:val="NoSpacing"/>
       </w:pPr>
       <w:r>
         <w:pict w14:anchorId="5A5B156E">
-          <v:rect id="_x0000_i1101" style="width:0;height:1.5pt" o:hralign="center" o:hrstd="t" o:hr="t" fillcolor="#a0a0a0" stroked="f"/>
+          <v:rect id="_x0000_i1029" style="width:0;height:1.5pt" o:hralign="center" o:hrstd="t" o:hr="t" fillcolor="#a0a0a0" stroked="f"/>
         </w:pict>
       </w:r>
     </w:p>
@@ -1980,7 +2190,6 @@
         </w:numPr>
       </w:pPr>
       <w:r>
-        <w:lastRenderedPageBreak/>
         <w:t xml:space="preserve">Target group name: </w:t>
       </w:r>
       <w:proofErr w:type="spellStart"/>
@@ -2475,7 +2684,7 @@
       </w:pPr>
       <w:r>
         <w:pict w14:anchorId="7351FCA4">
-          <v:rect id="_x0000_i1102" style="width:0;height:1.5pt" o:hralign="center" o:hrstd="t" o:hr="t" fillcolor="#a0a0a0" stroked="f"/>
+          <v:rect id="_x0000_i1030" style="width:0;height:1.5pt" o:hralign="center" o:hrstd="t" o:hr="t" fillcolor="#a0a0a0" stroked="f"/>
         </w:pict>
       </w:r>
     </w:p>
@@ -2539,6 +2748,7 @@
         </w:numPr>
       </w:pPr>
       <w:r>
+        <w:lastRenderedPageBreak/>
         <w:t xml:space="preserve">Configure: </w:t>
       </w:r>
     </w:p>
@@ -2947,7 +3157,6 @@
         </w:numPr>
       </w:pPr>
       <w:r>
-        <w:lastRenderedPageBreak/>
         <w:t xml:space="preserve">Click </w:t>
       </w:r>
       <w:r>
@@ -2977,15 +3186,7 @@
         <w:t>DNS name</w:t>
       </w:r>
       <w:r>
-        <w:t xml:space="preserve"> of the internal ALB — you need this for the </w:t>
-      </w:r>
-      <w:proofErr w:type="gramStart"/>
-      <w:r>
-        <w:t>frontend .env</w:t>
-      </w:r>
-      <w:proofErr w:type="gramEnd"/>
-      <w:r>
-        <w:t xml:space="preserve"> and ECS task definition</w:t>
+        <w:t xml:space="preserve"> of the internal ALB — you need this for the frontend .env and ECS task definition</w:t>
       </w:r>
     </w:p>
     <w:p>
@@ -2994,7 +3195,7 @@
       </w:pPr>
       <w:r>
         <w:pict w14:anchorId="2B561E0F">
-          <v:rect id="_x0000_i1103" style="width:0;height:1.5pt" o:hralign="center" o:hrstd="t" o:hr="t" fillcolor="#a0a0a0" stroked="f"/>
+          <v:rect id="_x0000_i1031" style="width:0;height:1.5pt" o:hralign="center" o:hrstd="t" o:hr="t" fillcolor="#a0a0a0" stroked="f"/>
         </w:pict>
       </w:r>
     </w:p>
@@ -3031,15 +3232,7 @@
         </w:numPr>
       </w:pPr>
       <w:r>
-        <w:t>On your local machine update frontend</w:t>
-      </w:r>
-      <w:proofErr w:type="gramStart"/>
-      <w:r>
-        <w:t>/.env</w:t>
-      </w:r>
-      <w:proofErr w:type="gramEnd"/>
-      <w:r>
-        <w:t xml:space="preserve">: </w:t>
+        <w:t xml:space="preserve">On your local machine update frontend/.env: </w:t>
       </w:r>
     </w:p>
     <w:p>
@@ -3072,7 +3265,7 @@
       </w:pPr>
       <w:r>
         <w:pict w14:anchorId="21CBF04E">
-          <v:rect id="_x0000_i1104" style="width:0;height:1.5pt" o:hralign="center" o:hrstd="t" o:hr="t" fillcolor="#a0a0a0" stroked="f"/>
+          <v:rect id="_x0000_i1032" style="width:0;height:1.5pt" o:hralign="center" o:hrstd="t" o:hr="t" fillcolor="#a0a0a0" stroked="f"/>
         </w:pict>
       </w:r>
     </w:p>
@@ -3182,7 +3375,7 @@
       </w:pPr>
       <w:r>
         <w:pict w14:anchorId="27CEA56C">
-          <v:rect id="_x0000_i1105" style="width:0;height:1.5pt" o:hralign="center" o:hrstd="t" o:hr="t" fillcolor="#a0a0a0" stroked="f"/>
+          <v:rect id="_x0000_i1033" style="width:0;height:1.5pt" o:hralign="center" o:hrstd="t" o:hr="t" fillcolor="#a0a0a0" stroked="f"/>
         </w:pict>
       </w:r>
     </w:p>
@@ -3346,6 +3539,7 @@
         </w:numPr>
       </w:pPr>
       <w:r>
+        <w:lastRenderedPageBreak/>
         <w:t xml:space="preserve">Task role: </w:t>
       </w:r>
       <w:r>
@@ -3413,13 +3607,8 @@
         </w:numPr>
       </w:pPr>
       <w:r>
-        <w:t>Image URI: &lt;ACCOUNT&gt;.dkr.ecr.us-east-1.amazonaws.com/content-moderator-</w:t>
-      </w:r>
-      <w:proofErr w:type="gramStart"/>
-      <w:r>
-        <w:t>frontend:latest</w:t>
-      </w:r>
-      <w:proofErr w:type="gramEnd"/>
+        <w:t>Image URI: &lt;ACCOUNT&gt;.dkr.ecr.us-east-1.amazonaws.com/content-moderator-frontend:latest</w:t>
+      </w:r>
     </w:p>
     <w:p>
       <w:pPr>
@@ -3684,7 +3873,6 @@
         </w:numPr>
       </w:pPr>
       <w:r>
-        <w:lastRenderedPageBreak/>
         <w:t>Task role: content-moderation-task-execution-role (the role with DynamoDB + Bedrock permissions)</w:t>
       </w:r>
     </w:p>
@@ -3742,13 +3930,8 @@
         </w:numPr>
       </w:pPr>
       <w:r>
-        <w:t>Image URI: &lt;ACCOUNT&gt;.dkr.ecr.us-east-1.amazonaws.com/content-moderator-</w:t>
-      </w:r>
-      <w:proofErr w:type="gramStart"/>
-      <w:r>
-        <w:t>backend:latest</w:t>
-      </w:r>
-      <w:proofErr w:type="gramEnd"/>
+        <w:t>Image URI: &lt;ACCOUNT&gt;.dkr.ecr.us-east-1.amazonaws.com/content-moderator-backend:latest</w:t>
+      </w:r>
     </w:p>
     <w:p>
       <w:pPr>
@@ -4039,13 +4222,8 @@
             <w:pPr>
               <w:pStyle w:val="NoSpacing"/>
             </w:pPr>
-            <w:proofErr w:type="gramStart"/>
             <w:r>
-              <w:t>us.anthropic</w:t>
-            </w:r>
-            <w:proofErr w:type="gramEnd"/>
-            <w:r>
-              <w:t>.claude-sonnet-4-6-20250514-v1:0</w:t>
+              <w:t>us.anthropic.claude-sonnet-4-6-20250514-v1:0</w:t>
             </w:r>
           </w:p>
         </w:tc>
@@ -4139,7 +4317,7 @@
       </w:pPr>
       <w:r>
         <w:pict w14:anchorId="3DACE5D8">
-          <v:rect id="_x0000_i1106" style="width:0;height:1.5pt" o:hralign="center" o:hrstd="t" o:hr="t" fillcolor="#a0a0a0" stroked="f"/>
+          <v:rect id="_x0000_i1034" style="width:0;height:1.5pt" o:hralign="center" o:hrstd="t" o:hr="t" fillcolor="#a0a0a0" stroked="f"/>
         </w:pict>
       </w:r>
     </w:p>
@@ -4287,6 +4465,7 @@
         </w:numPr>
       </w:pPr>
       <w:r>
+        <w:lastRenderedPageBreak/>
         <w:t xml:space="preserve">Networking: </w:t>
       </w:r>
     </w:p>
@@ -4456,15 +4635,7 @@
         </w:numPr>
       </w:pPr>
       <w:r>
-        <w:t xml:space="preserve">Container to load balance: select </w:t>
-      </w:r>
-      <w:proofErr w:type="gramStart"/>
-      <w:r>
-        <w:t>frontend :</w:t>
-      </w:r>
-      <w:proofErr w:type="gramEnd"/>
-      <w:r>
-        <w:t xml:space="preserve"> 3000</w:t>
+        <w:t>Container to load balance: select frontend : 3000</w:t>
       </w:r>
     </w:p>
     <w:p>
@@ -4478,21 +4649,12 @@
       <w:r>
         <w:t xml:space="preserve">Listener: select the existing </w:t>
       </w:r>
-      <w:proofErr w:type="gramStart"/>
-      <w:r>
-        <w:rPr>
-          <w:b/>
-          <w:bCs/>
-        </w:rPr>
-        <w:t>443 :</w:t>
-      </w:r>
-      <w:proofErr w:type="gramEnd"/>
-      <w:r>
-        <w:rPr>
-          <w:b/>
-          <w:bCs/>
-        </w:rPr>
-        <w:t xml:space="preserve"> HTTPS</w:t>
+      <w:r>
+        <w:rPr>
+          <w:b/>
+          <w:bCs/>
+        </w:rPr>
+        <w:t>443 : HTTPS</w:t>
       </w:r>
       <w:r>
         <w:t xml:space="preserve"> listener</w:t>
@@ -4665,7 +4827,6 @@
         </w:numPr>
       </w:pPr>
       <w:r>
-        <w:lastRenderedPageBreak/>
         <w:t xml:space="preserve">Networking: </w:t>
       </w:r>
     </w:p>
@@ -4835,15 +4996,7 @@
         </w:numPr>
       </w:pPr>
       <w:r>
-        <w:t xml:space="preserve">Container to load balance: select </w:t>
-      </w:r>
-      <w:proofErr w:type="gramStart"/>
-      <w:r>
-        <w:t>backend :</w:t>
-      </w:r>
-      <w:proofErr w:type="gramEnd"/>
-      <w:r>
-        <w:t xml:space="preserve"> 8000</w:t>
+        <w:t>Container to load balance: select backend : 8000</w:t>
       </w:r>
     </w:p>
     <w:p>
@@ -4857,21 +5010,12 @@
       <w:r>
         <w:t xml:space="preserve">Listener: select the existing </w:t>
       </w:r>
-      <w:proofErr w:type="gramStart"/>
-      <w:r>
-        <w:rPr>
-          <w:b/>
-          <w:bCs/>
-        </w:rPr>
-        <w:t>80 :</w:t>
-      </w:r>
-      <w:proofErr w:type="gramEnd"/>
-      <w:r>
-        <w:rPr>
-          <w:b/>
-          <w:bCs/>
-        </w:rPr>
-        <w:t xml:space="preserve"> HTTP</w:t>
+      <w:r>
+        <w:rPr>
+          <w:b/>
+          <w:bCs/>
+        </w:rPr>
+        <w:t>80 : HTTP</w:t>
       </w:r>
       <w:r>
         <w:t xml:space="preserve"> listener</w:t>
@@ -4922,7 +5066,7 @@
       </w:pPr>
       <w:r>
         <w:pict w14:anchorId="2CFA5F7E">
-          <v:rect id="_x0000_i1107" style="width:0;height:1.5pt" o:hralign="center" o:hrstd="t" o:hr="t" fillcolor="#a0a0a0" stroked="f"/>
+          <v:rect id="_x0000_i1035" style="width:0;height:1.5pt" o:hralign="center" o:hrstd="t" o:hr="t" fillcolor="#a0a0a0" stroked="f"/>
         </w:pict>
       </w:r>
     </w:p>
@@ -5233,7 +5377,7 @@
       </w:pPr>
       <w:r>
         <w:pict w14:anchorId="1C2E3E51">
-          <v:rect id="_x0000_i1108" style="width:0;height:1.5pt" o:hralign="center" o:hrstd="t" o:hr="t" fillcolor="#a0a0a0" stroked="f"/>
+          <v:rect id="_x0000_i1036" style="width:0;height:1.5pt" o:hralign="center" o:hrstd="t" o:hr="t" fillcolor="#a0a0a0" stroked="f"/>
         </w:pict>
       </w:r>
     </w:p>
@@ -5250,6 +5394,7 @@
           <w:b/>
           <w:bCs/>
         </w:rPr>
+        <w:lastRenderedPageBreak/>
         <w:t>Troubleshooting checklist</w:t>
       </w:r>
     </w:p>
@@ -5464,15 +5609,7 @@
               <w:pStyle w:val="NoSpacing"/>
             </w:pPr>
             <w:r>
-              <w:t xml:space="preserve">Internal ALB DNS not set correctly in </w:t>
-            </w:r>
-            <w:proofErr w:type="gramStart"/>
-            <w:r>
-              <w:t>frontend .env</w:t>
-            </w:r>
-            <w:proofErr w:type="gramEnd"/>
-            <w:r>
-              <w:t xml:space="preserve"> at build time</w:t>
+              <w:t>Internal ALB DNS not set correctly in frontend .env at build time</w:t>
             </w:r>
           </w:p>
         </w:tc>
@@ -5515,22 +5652,18 @@
               <w:t xml:space="preserve">IAM Task Role missing </w:t>
             </w:r>
             <w:proofErr w:type="spellStart"/>
-            <w:proofErr w:type="gramStart"/>
             <w:r>
               <w:t>bedrock:InvokeModel</w:t>
             </w:r>
             <w:proofErr w:type="spellEnd"/>
-            <w:proofErr w:type="gramEnd"/>
             <w:r>
               <w:t xml:space="preserve"> and </w:t>
             </w:r>
             <w:proofErr w:type="spellStart"/>
-            <w:proofErr w:type="gramStart"/>
             <w:r>
               <w:t>bedrock:Converse</w:t>
             </w:r>
             <w:proofErr w:type="spellEnd"/>
-            <w:proofErr w:type="gramEnd"/>
           </w:p>
         </w:tc>
       </w:tr>
@@ -8629,6 +8762,7 @@
   <w:style w:type="character" w:default="1" w:styleId="DefaultParagraphFont">
     <w:name w:val="Default Paragraph Font"/>
     <w:uiPriority w:val="1"/>
+    <w:semiHidden/>
     <w:unhideWhenUsed/>
   </w:style>
   <w:style w:type="table" w:default="1" w:styleId="TableNormal">

</xml_diff>